<commit_message>
Refine README dependencies description and improve CustomerID academic phrasing
</commit_message>
<xml_diff>
--- a/report/ShauryaSalona_ProjectReport.docx
+++ b/report/ShauryaSalona_ProjectReport.docx
@@ -997,7 +997,7 @@
           </w:tcPr>
           <w:p>
             <w:r>
-              <w:t>Unique customer ID (135,080 nulls in raw data for guest checkouts).</w:t>
+              <w:t>Unique customer ID (135,080 records have missing customer IDs in the raw dataset).</w:t>
             </w:r>
           </w:p>
         </w:tc>
@@ -1131,7 +1131,7 @@
         <w:br/>
         <w:t>• Non-Commercial Adjustments: 2,517 rows had unit prices &lt;= 0, containing notes like 'damages', 'check', 'lost', and debt adjustments. These were excluded from sales totals.</w:t>
         <w:br/>
-        <w:t>• Missing CustomerIDs: 135,080 rows (24.93%) lacked customer IDs (guest checkouts). These were preserved for macro sales analytics but segregated from RFM and ML modeling.</w:t>
+        <w:t>• Missing CustomerIDs: 135,080 rows (24.93%) lacked customer IDs (unregistered/missing client identifiers). These were preserved for macro sales analytics but segregated from RFM and ML modeling.</w:t>
       </w:r>
     </w:p>
     <w:tbl>
@@ -3833,7 +3833,7 @@
       <w:r>
         <w:t>1. Non-Contractual Proxy Definition: Because accounts do not formally terminate, churn was estimated using a 3.5-month evaluation window proxy. Some customers may re-engage in subsequent years.</w:t>
         <w:br/>
-        <w:t>2. Guest Checkout Records: 24.9% of transactions lacked a CustomerID, precluding them from RFM and ML tracking.</w:t>
+        <w:t>2. Missing Customer Identifiers: 24.9% of transactions lacked a CustomerID, precluding them from RFM and ML tracking.</w:t>
         <w:br/>
         <w:t>3. Partial December Observation: Data terminates on December 9, 2011, providing only 9 days of sales for December 2011.</w:t>
       </w:r>

</xml_diff>

<commit_message>
Update dataset source to reference Kaggle E-Commerce dataset exclusively
</commit_message>
<xml_diff>
--- a/report/ShauryaSalona_ProjectReport.docx
+++ b/report/ShauryaSalona_ProjectReport.docx
@@ -213,7 +213,7 @@
     </w:p>
     <w:p>
       <w:r>
-        <w:t>This project presents an end-to-end commercial analytics and predictive machine learning system developed for a multinational e-commerce retailer. Using the actual UCI Online Retail transaction dataset comprising 541,909 records spanning December 2010 through December 2011, this study audits data quality, establishes store-level KPIs, conducts granular diagnostic analytics, segments the customer base using Recency-Frequency-Monetary (RFM) modeling, and builds an early-warning churn prediction model using Logistic Regression.</w:t>
+        <w:t>This project presents an end-to-end commercial analytics and predictive machine learning system developed for a multinational e-commerce retailer. Using the actual Kaggle E-Commerce transaction dataset comprising 541,909 records spanning December 2010 through December 2011, this study audits data quality, establishes store-level KPIs, conducts granular diagnostic analytics, segments the customer base using Recency-Frequency-Monetary (RFM) modeling, and builds an early-warning churn prediction model using Logistic Regression.</w:t>
         <w:br/>
         <w:br/>
         <w:t>Key empirical findings from the executed pipeline include:</w:t>
@@ -432,7 +432,7 @@
     </w:p>
     <w:p>
       <w:r>
-        <w:t>The project utilizes the actual UCI Online Retail Transaction Dataset. It contains 541,909 individual purchase records spanning from December 1, 2010 to December 9, 2011. The underlying enterprise is a UK-based registered e-commerce platform specializing in unique all-occasion giftware, serving both retail consumers and wholesale commercial businesses across 38 international countries.</w:t>
+        <w:t>The project utilizes the actual Kaggle E-Commerce Transaction Dataset. It contains 541,909 individual purchase records spanning from December 1, 2010 to December 9, 2011. The underlying enterprise is a UK-based registered e-commerce platform specializing in unique all-occasion giftware, serving both retail consumers and wholesale commercial businesses across 38 international countries.</w:t>
       </w:r>
     </w:p>
     <w:p>

</xml_diff>